<commit_message>
Đưa thể thức NĐ 30/2020 và quy tắc bảng nhiều trang vào 170 skill; bổ sung trường đầu vào cho 9 skill văn bản chính; validator khóa; bộ kiểm tra nâng cấp
Co-Authored-By: Claude Sonnet 5.5 <noreply@anthropic.com>
Claude-Session: https://claude.ai/code/session_01T37v9MbVMU9yXHRJ84QwZj
</commit_message>
<xml_diff>
--- a/tests/outputs/ke-hoach-thanh-tra-nam.docx
+++ b/tests/outputs/ke-hoach-thanh-tra-nam.docx
@@ -24,16 +24,21 @@
       <w:tr>
         <w:tc>
           <w:tcPr>
-            <w:tcW w:type="dxa" w:w="4535"/>
+            <w:tcW w:type="dxa" w:w="3742"/>
           </w:tcPr>
           <w:p>
             <w:pPr>
-              <w:spacing w:after="0"/>
+              <w:spacing w:after="80"/>
+              <w:ind w:left="113" w:right="113"/>
               <w:jc w:val="center"/>
+              <w:pBdr>
+                <w:bottom w:val="single" w:sz="4" w:space="1" w:color="000000"/>
+              </w:pBdr>
             </w:pPr>
             <w:r>
               <w:rPr>
                 <w:b/>
+                <w:sz w:val="24"/>
               </w:rPr>
             </w:r>
             <w:r>
@@ -54,7 +59,7 @@
               <w:rPr>
                 <w:rFonts w:ascii="Times New Roman" w:hAnsi="Times New Roman" w:eastAsia="Times New Roman"/>
                 <w:b w:val="0"/>
-                <w:sz w:val="24"/>
+                <w:sz w:val="26"/>
               </w:rPr>
               <w:t>Số: ............/KH-......</w:t>
             </w:r>
@@ -62,22 +67,25 @@
         </w:tc>
         <w:tc>
           <w:tcPr>
-            <w:tcW w:type="dxa" w:w="4535"/>
+            <w:tcW w:type="dxa" w:w="5329"/>
           </w:tcPr>
           <w:p>
             <w:pPr>
-              <w:spacing w:after="0"/>
+              <w:spacing w:after="80"/>
               <w:jc w:val="center"/>
             </w:pPr>
             <w:r>
               <w:rPr>
                 <w:b/>
+                <w:i w:val="0"/>
+                <w:sz w:val="24"/>
               </w:rPr>
             </w:r>
             <w:r>
               <w:rPr>
                 <w:rFonts w:ascii="Times New Roman" w:hAnsi="Times New Roman" w:eastAsia="Times New Roman"/>
                 <w:b/>
+                <w:i w:val="0"/>
                 <w:sz w:val="24"/>
               </w:rPr>
               <w:t>CỘNG HÒA XÃ HỘI CHỦ NGHĨA VIỆT NAM</w:t>
@@ -85,21 +93,26 @@
           </w:p>
           <w:p>
             <w:pPr>
-              <w:spacing w:after="0"/>
+              <w:spacing w:after="80"/>
+              <w:ind w:left="907" w:right="907"/>
               <w:jc w:val="center"/>
+              <w:pBdr>
+                <w:bottom w:val="single" w:sz="4" w:space="1" w:color="000000"/>
+              </w:pBdr>
             </w:pPr>
             <w:r>
               <w:rPr>
                 <w:rFonts w:ascii="Times New Roman" w:hAnsi="Times New Roman" w:eastAsia="Times New Roman"/>
                 <w:b/>
-                <w:sz w:val="24"/>
+                <w:i w:val="0"/>
+                <w:sz w:val="26"/>
               </w:rPr>
-              <w:t>Độc lập – Tự do – Hạnh phúc</w:t>
+              <w:t>Độc lập - Tự do - Hạnh phúc</w:t>
             </w:r>
           </w:p>
           <w:p>
             <w:pPr>
-              <w:spacing w:after="0"/>
+              <w:spacing w:after="80"/>
               <w:jc w:val="center"/>
             </w:pPr>
             <w:r>
@@ -107,7 +120,7 @@
                 <w:rFonts w:ascii="Times New Roman" w:hAnsi="Times New Roman" w:eastAsia="Times New Roman"/>
                 <w:b w:val="0"/>
                 <w:i/>
-                <w:sz w:val="24"/>
+                <w:sz w:val="26"/>
               </w:rPr>
               <w:t>Hà Nội, ngày ..... tháng ..... năm ........</w:t>
             </w:r>
@@ -1152,7 +1165,8 @@
             <w:r>
               <w:rPr>
                 <w:rFonts w:ascii="Times New Roman" w:hAnsi="Times New Roman" w:eastAsia="Times New Roman"/>
-                <w:b w:val="0"/>
+                <w:b/>
+                <w:i/>
                 <w:sz w:val="24"/>
               </w:rPr>
               <w:t>Nơi nhận:</w:t>
@@ -1167,7 +1181,7 @@
               <w:rPr>
                 <w:rFonts w:ascii="Times New Roman" w:hAnsi="Times New Roman" w:eastAsia="Times New Roman"/>
                 <w:b w:val="0"/>
-                <w:sz w:val="24"/>
+                <w:sz w:val="22"/>
               </w:rPr>
               <w:t>- Các đơn vị được thanh tra và đơn vị liên quan (để thực hiện);</w:t>
             </w:r>
@@ -1181,7 +1195,7 @@
               <w:rPr>
                 <w:rFonts w:ascii="Times New Roman" w:hAnsi="Times New Roman" w:eastAsia="Times New Roman"/>
                 <w:b w:val="0"/>
-                <w:sz w:val="24"/>
+                <w:sz w:val="22"/>
               </w:rPr>
               <w:t>- Lưu: VT, .......</w:t>
             </w:r>

</xml_diff>